<commit_message>
Se agregaron los retos de javascript en el archivo "practica.js", mas sus archivos con evidencias en los archivos word
</commit_message>
<xml_diff>
--- a/TIENDA_REACT.docx
+++ b/TIENDA_REACT.docx
@@ -263,32 +263,24 @@
           <w:sz w:val="28"/>
         </w:rPr>
         <w:lastRenderedPageBreak/>
-        <w:t>2.</w:t>
-      </w:r>
-      <w:r>
-        <w:rPr>
-          <w:rFonts w:ascii="Times New Roman" w:hAnsi="Times New Roman"/>
-          <w:b/>
-          <w:bCs/>
-          <w:sz w:val="28"/>
-        </w:rPr>
-        <w:t xml:space="preserve"> VERIFICACION DE IDENTIDAD DE GIT</w:t>
-      </w:r>
-    </w:p>
-    <w:p>
-      <w:pPr>
-        <w:rPr>
-          <w:rFonts w:ascii="Times New Roman" w:hAnsi="Times New Roman"/>
-          <w:b/>
-          <w:bCs/>
-          <w:sz w:val="28"/>
-        </w:rPr>
-      </w:pPr>
-      <w:r>
-        <w:rPr>
-          <w:rFonts w:ascii="Times New Roman" w:hAnsi="Times New Roman"/>
-          <w:b/>
-          <w:bCs/>
+        <w:t>VERIFICACION DE IDENTIDAD DE GIT</w:t>
+      </w:r>
+    </w:p>
+    <w:p>
+      <w:pPr>
+        <w:rPr>
+          <w:rFonts w:ascii="Times New Roman" w:hAnsi="Times New Roman"/>
+          <w:b/>
+          <w:bCs/>
+          <w:sz w:val="28"/>
+        </w:rPr>
+      </w:pPr>
+      <w:r>
+        <w:rPr>
+          <w:rFonts w:ascii="Times New Roman" w:hAnsi="Times New Roman"/>
+          <w:b/>
+          <w:bCs/>
+          <w:noProof/>
           <w:sz w:val="28"/>
         </w:rPr>
         <w:drawing>
@@ -337,6 +329,408 @@
           <w:sz w:val="28"/>
         </w:rPr>
       </w:pPr>
+    </w:p>
+    <w:p>
+      <w:pPr>
+        <w:rPr>
+          <w:rFonts w:ascii="Times New Roman" w:hAnsi="Times New Roman"/>
+          <w:b/>
+          <w:bCs/>
+          <w:sz w:val="28"/>
+        </w:rPr>
+      </w:pPr>
+      <w:r>
+        <w:rPr>
+          <w:rFonts w:ascii="Times New Roman" w:hAnsi="Times New Roman"/>
+          <w:b/>
+          <w:bCs/>
+          <w:sz w:val="28"/>
+        </w:rPr>
+        <w:t>CREAR EL LABORATORIO DE JavaScript.</w:t>
+      </w:r>
+    </w:p>
+    <w:p>
+      <w:pPr>
+        <w:rPr>
+          <w:rFonts w:ascii="Times New Roman" w:hAnsi="Times New Roman"/>
+          <w:sz w:val="28"/>
+        </w:rPr>
+      </w:pPr>
+      <w:r>
+        <w:rPr>
+          <w:rFonts w:ascii="Times New Roman" w:hAnsi="Times New Roman"/>
+          <w:sz w:val="28"/>
+        </w:rPr>
+        <w:t xml:space="preserve">Comprobar que </w:t>
+      </w:r>
+      <w:proofErr w:type="spellStart"/>
+      <w:r>
+        <w:rPr>
+          <w:rFonts w:ascii="Times New Roman" w:hAnsi="Times New Roman"/>
+          <w:sz w:val="28"/>
+        </w:rPr>
+        <w:t>node</w:t>
+      </w:r>
+      <w:proofErr w:type="spellEnd"/>
+      <w:r>
+        <w:rPr>
+          <w:rFonts w:ascii="Times New Roman" w:hAnsi="Times New Roman"/>
+          <w:sz w:val="28"/>
+        </w:rPr>
+        <w:t xml:space="preserve"> pueda ejecutar el archivo practica.js</w:t>
+      </w:r>
+    </w:p>
+    <w:p>
+      <w:pPr>
+        <w:rPr>
+          <w:rFonts w:ascii="Times New Roman" w:hAnsi="Times New Roman"/>
+          <w:sz w:val="28"/>
+        </w:rPr>
+      </w:pPr>
+      <w:r>
+        <w:rPr>
+          <w:rFonts w:ascii="Times New Roman" w:hAnsi="Times New Roman"/>
+          <w:sz w:val="28"/>
+        </w:rPr>
+        <w:drawing>
+          <wp:inline distT="0" distB="0" distL="0" distR="0" wp14:anchorId="3CCA95D9" wp14:editId="42E38404">
+            <wp:extent cx="5572903" cy="2457793"/>
+            <wp:effectExtent l="0" t="0" r="8890" b="0"/>
+            <wp:docPr id="601128991" name="Imagen 1"/>
+            <wp:cNvGraphicFramePr>
+              <a:graphicFrameLocks xmlns:a="http://schemas.openxmlformats.org/drawingml/2006/main" noChangeAspect="1"/>
+            </wp:cNvGraphicFramePr>
+            <a:graphic xmlns:a="http://schemas.openxmlformats.org/drawingml/2006/main">
+              <a:graphicData uri="http://schemas.openxmlformats.org/drawingml/2006/picture">
+                <pic:pic xmlns:pic="http://schemas.openxmlformats.org/drawingml/2006/picture">
+                  <pic:nvPicPr>
+                    <pic:cNvPr id="601128991" name=""/>
+                    <pic:cNvPicPr/>
+                  </pic:nvPicPr>
+                  <pic:blipFill>
+                    <a:blip r:embed="rId5"/>
+                    <a:stretch>
+                      <a:fillRect/>
+                    </a:stretch>
+                  </pic:blipFill>
+                  <pic:spPr>
+                    <a:xfrm>
+                      <a:off x="0" y="0"/>
+                      <a:ext cx="5572903" cy="2457793"/>
+                    </a:xfrm>
+                    <a:prstGeom prst="rect">
+                      <a:avLst/>
+                    </a:prstGeom>
+                  </pic:spPr>
+                </pic:pic>
+              </a:graphicData>
+            </a:graphic>
+          </wp:inline>
+        </w:drawing>
+      </w:r>
+    </w:p>
+    <w:p>
+      <w:pPr>
+        <w:rPr>
+          <w:rFonts w:ascii="Times New Roman" w:hAnsi="Times New Roman"/>
+          <w:sz w:val="28"/>
+        </w:rPr>
+      </w:pPr>
+    </w:p>
+    <w:p>
+      <w:pPr>
+        <w:rPr>
+          <w:rFonts w:ascii="Times New Roman" w:hAnsi="Times New Roman"/>
+          <w:b/>
+          <w:bCs/>
+          <w:sz w:val="28"/>
+        </w:rPr>
+      </w:pPr>
+      <w:r>
+        <w:rPr>
+          <w:rFonts w:ascii="Times New Roman" w:hAnsi="Times New Roman"/>
+          <w:b/>
+          <w:bCs/>
+          <w:sz w:val="28"/>
+        </w:rPr>
+        <w:br w:type="page"/>
+      </w:r>
+    </w:p>
+    <w:p>
+      <w:pPr>
+        <w:rPr>
+          <w:rFonts w:ascii="Times New Roman" w:hAnsi="Times New Roman"/>
+          <w:b/>
+          <w:bCs/>
+          <w:sz w:val="28"/>
+        </w:rPr>
+      </w:pPr>
+      <w:r>
+        <w:rPr>
+          <w:rFonts w:ascii="Times New Roman" w:hAnsi="Times New Roman"/>
+          <w:b/>
+          <w:bCs/>
+          <w:sz w:val="28"/>
+        </w:rPr>
+        <w:t>RETO 1</w:t>
+      </w:r>
+      <w:r>
+        <w:rPr>
+          <w:rFonts w:ascii="Times New Roman" w:hAnsi="Times New Roman"/>
+          <w:b/>
+          <w:bCs/>
+          <w:sz w:val="28"/>
+        </w:rPr>
+        <w:t xml:space="preserve">: Funciones, parámetros y </w:t>
+      </w:r>
+      <w:proofErr w:type="spellStart"/>
+      <w:r>
+        <w:rPr>
+          <w:rFonts w:ascii="Times New Roman" w:hAnsi="Times New Roman"/>
+          <w:b/>
+          <w:bCs/>
+          <w:sz w:val="28"/>
+        </w:rPr>
+        <w:t>return</w:t>
+      </w:r>
+      <w:proofErr w:type="spellEnd"/>
+    </w:p>
+    <w:p>
+      <w:pPr>
+        <w:rPr>
+          <w:rFonts w:ascii="Times New Roman" w:hAnsi="Times New Roman"/>
+          <w:b/>
+          <w:bCs/>
+          <w:sz w:val="28"/>
+        </w:rPr>
+      </w:pPr>
+      <w:r>
+        <w:rPr>
+          <w:rFonts w:ascii="Times New Roman" w:hAnsi="Times New Roman"/>
+          <w:b/>
+          <w:bCs/>
+          <w:sz w:val="28"/>
+        </w:rPr>
+        <w:drawing>
+          <wp:inline distT="0" distB="0" distL="0" distR="0" wp14:anchorId="19780776" wp14:editId="626BDA43">
+            <wp:extent cx="3856383" cy="2995759"/>
+            <wp:effectExtent l="0" t="0" r="0" b="0"/>
+            <wp:docPr id="1116828761" name="Imagen 1"/>
+            <wp:cNvGraphicFramePr>
+              <a:graphicFrameLocks xmlns:a="http://schemas.openxmlformats.org/drawingml/2006/main" noChangeAspect="1"/>
+            </wp:cNvGraphicFramePr>
+            <a:graphic xmlns:a="http://schemas.openxmlformats.org/drawingml/2006/main">
+              <a:graphicData uri="http://schemas.openxmlformats.org/drawingml/2006/picture">
+                <pic:pic xmlns:pic="http://schemas.openxmlformats.org/drawingml/2006/picture">
+                  <pic:nvPicPr>
+                    <pic:cNvPr id="1116828761" name=""/>
+                    <pic:cNvPicPr/>
+                  </pic:nvPicPr>
+                  <pic:blipFill>
+                    <a:blip r:embed="rId6"/>
+                    <a:stretch>
+                      <a:fillRect/>
+                    </a:stretch>
+                  </pic:blipFill>
+                  <pic:spPr>
+                    <a:xfrm>
+                      <a:off x="0" y="0"/>
+                      <a:ext cx="3862157" cy="3000245"/>
+                    </a:xfrm>
+                    <a:prstGeom prst="rect">
+                      <a:avLst/>
+                    </a:prstGeom>
+                  </pic:spPr>
+                </pic:pic>
+              </a:graphicData>
+            </a:graphic>
+          </wp:inline>
+        </w:drawing>
+      </w:r>
+    </w:p>
+    <w:p>
+      <w:pPr>
+        <w:rPr>
+          <w:rFonts w:ascii="Times New Roman" w:hAnsi="Times New Roman"/>
+          <w:sz w:val="28"/>
+        </w:rPr>
+      </w:pPr>
+      <w:r>
+        <w:rPr>
+          <w:rFonts w:ascii="Times New Roman" w:hAnsi="Times New Roman"/>
+          <w:b/>
+          <w:bCs/>
+          <w:sz w:val="28"/>
+        </w:rPr>
+        <w:t xml:space="preserve">TAREA: </w:t>
+      </w:r>
+      <w:r>
+        <w:rPr>
+          <w:rFonts w:ascii="Times New Roman" w:hAnsi="Times New Roman"/>
+          <w:sz w:val="28"/>
+        </w:rPr>
+        <w:t>Funciones sumar, restar, multiplicar, dividir y promedio. Además, explicación de la diferencia entre ‘</w:t>
+      </w:r>
+      <w:proofErr w:type="spellStart"/>
+      <w:r>
+        <w:rPr>
+          <w:rFonts w:ascii="Times New Roman" w:hAnsi="Times New Roman"/>
+          <w:sz w:val="28"/>
+        </w:rPr>
+        <w:t>Return</w:t>
+      </w:r>
+      <w:proofErr w:type="spellEnd"/>
+      <w:r>
+        <w:rPr>
+          <w:rFonts w:ascii="Times New Roman" w:hAnsi="Times New Roman"/>
+          <w:sz w:val="28"/>
+        </w:rPr>
+        <w:t>’ y ‘console.log’</w:t>
+      </w:r>
+    </w:p>
+    <w:p>
+      <w:pPr>
+        <w:rPr>
+          <w:rFonts w:ascii="Times New Roman" w:hAnsi="Times New Roman"/>
+          <w:b/>
+          <w:bCs/>
+          <w:sz w:val="28"/>
+        </w:rPr>
+      </w:pPr>
+      <w:r>
+        <w:rPr>
+          <w:rFonts w:ascii="Times New Roman" w:hAnsi="Times New Roman"/>
+          <w:b/>
+          <w:bCs/>
+          <w:sz w:val="28"/>
+        </w:rPr>
+        <w:drawing>
+          <wp:inline distT="0" distB="0" distL="0" distR="0" wp14:anchorId="4E70A688" wp14:editId="5288B382">
+            <wp:extent cx="3856383" cy="3984105"/>
+            <wp:effectExtent l="0" t="0" r="0" b="0"/>
+            <wp:docPr id="251118738" name="Imagen 1"/>
+            <wp:cNvGraphicFramePr>
+              <a:graphicFrameLocks xmlns:a="http://schemas.openxmlformats.org/drawingml/2006/main" noChangeAspect="1"/>
+            </wp:cNvGraphicFramePr>
+            <a:graphic xmlns:a="http://schemas.openxmlformats.org/drawingml/2006/main">
+              <a:graphicData uri="http://schemas.openxmlformats.org/drawingml/2006/picture">
+                <pic:pic xmlns:pic="http://schemas.openxmlformats.org/drawingml/2006/picture">
+                  <pic:nvPicPr>
+                    <pic:cNvPr id="251118738" name=""/>
+                    <pic:cNvPicPr/>
+                  </pic:nvPicPr>
+                  <pic:blipFill>
+                    <a:blip r:embed="rId7"/>
+                    <a:stretch>
+                      <a:fillRect/>
+                    </a:stretch>
+                  </pic:blipFill>
+                  <pic:spPr>
+                    <a:xfrm>
+                      <a:off x="0" y="0"/>
+                      <a:ext cx="3867134" cy="3995212"/>
+                    </a:xfrm>
+                    <a:prstGeom prst="rect">
+                      <a:avLst/>
+                    </a:prstGeom>
+                  </pic:spPr>
+                </pic:pic>
+              </a:graphicData>
+            </a:graphic>
+          </wp:inline>
+        </w:drawing>
+      </w:r>
+    </w:p>
+    <w:p>
+      <w:pPr>
+        <w:rPr>
+          <w:noProof/>
+        </w:rPr>
+      </w:pPr>
+      <w:r>
+        <w:rPr>
+          <w:noProof/>
+        </w:rPr>
+        <w:t xml:space="preserve"> </w:t>
+      </w:r>
+      <w:r>
+        <w:rPr>
+          <w:rFonts w:ascii="Times New Roman" w:hAnsi="Times New Roman"/>
+          <w:b/>
+          <w:bCs/>
+          <w:sz w:val="28"/>
+        </w:rPr>
+        <w:drawing>
+          <wp:inline distT="0" distB="0" distL="0" distR="0" wp14:anchorId="5D189197" wp14:editId="4114C9DC">
+            <wp:extent cx="3848432" cy="4072513"/>
+            <wp:effectExtent l="0" t="0" r="0" b="4445"/>
+            <wp:docPr id="778096743" name="Imagen 1"/>
+            <wp:cNvGraphicFramePr>
+              <a:graphicFrameLocks xmlns:a="http://schemas.openxmlformats.org/drawingml/2006/main" noChangeAspect="1"/>
+            </wp:cNvGraphicFramePr>
+            <a:graphic xmlns:a="http://schemas.openxmlformats.org/drawingml/2006/main">
+              <a:graphicData uri="http://schemas.openxmlformats.org/drawingml/2006/picture">
+                <pic:pic xmlns:pic="http://schemas.openxmlformats.org/drawingml/2006/picture">
+                  <pic:nvPicPr>
+                    <pic:cNvPr id="778096743" name=""/>
+                    <pic:cNvPicPr/>
+                  </pic:nvPicPr>
+                  <pic:blipFill>
+                    <a:blip r:embed="rId8"/>
+                    <a:stretch>
+                      <a:fillRect/>
+                    </a:stretch>
+                  </pic:blipFill>
+                  <pic:spPr>
+                    <a:xfrm>
+                      <a:off x="0" y="0"/>
+                      <a:ext cx="3875562" cy="4101223"/>
+                    </a:xfrm>
+                    <a:prstGeom prst="rect">
+                      <a:avLst/>
+                    </a:prstGeom>
+                  </pic:spPr>
+                </pic:pic>
+              </a:graphicData>
+            </a:graphic>
+          </wp:inline>
+        </w:drawing>
+      </w:r>
+    </w:p>
+    <w:p>
+      <w:pPr>
+        <w:rPr>
+          <w:rFonts w:ascii="Times New Roman" w:hAnsi="Times New Roman" w:cs="Times New Roman"/>
+          <w:b/>
+          <w:bCs/>
+          <w:noProof/>
+          <w:sz w:val="28"/>
+          <w:szCs w:val="28"/>
+        </w:rPr>
+      </w:pPr>
+    </w:p>
+    <w:p>
+      <w:pPr>
+        <w:rPr>
+          <w:rFonts w:ascii="Times New Roman" w:hAnsi="Times New Roman" w:cs="Times New Roman"/>
+          <w:b/>
+          <w:bCs/>
+          <w:noProof/>
+          <w:sz w:val="28"/>
+          <w:szCs w:val="28"/>
+        </w:rPr>
+      </w:pPr>
+      <w:r>
+        <w:rPr>
+          <w:rFonts w:ascii="Times New Roman" w:hAnsi="Times New Roman" w:cs="Times New Roman"/>
+          <w:b/>
+          <w:bCs/>
+          <w:noProof/>
+          <w:sz w:val="28"/>
+          <w:szCs w:val="28"/>
+        </w:rPr>
+        <w:t>RETO 2 - FUNCIONES TIPO FLECHA</w:t>
+      </w:r>
     </w:p>
     <w:sectPr>
       <w:pgSz w:w="12240" w:h="15840"/>

</xml_diff>